<commit_message>
Add Xin Wu as co-corresponding author (Dept. of Reproduction Medicine)
</commit_message>
<xml_diff>
--- a/Cover_Letter_JTM.docx
+++ b/Cover_Letter_JTM.docx
@@ -270,10 +270,31 @@
         <w:t xml:space="preserve"> </w:t>
       </w:r>
       <w:r>
-        <w:t xml:space="preserve">(l2840655442@163.com), Junhong Wang</w:t>
-      </w:r>
-      <w:r>
-        <w:t xml:space="preserve">1,2*</w:t>
+        <w:t xml:space="preserve">(l2840655442@163.com), Xin Wu</w:t>
+      </w:r>
+      <w:r>
+        <w:t xml:space="preserve">3</w:t>
+      </w:r>
+      <w:r>
+        <w:rPr>
+          <w:i/>
+          <w:iCs/>
+        </w:rPr>
+        <w:t xml:space="preserve"> </w:t>
+      </w:r>
+      <w:r>
+        <w:rPr>
+          <w:i/>
+          <w:iCs/>
+        </w:rPr>
+        <w:t xml:space="preserve">(wuxin0220@aliyun.com), Junhong Wang</w:t>
+      </w:r>
+      <w:r>
+        <w:rPr>
+          <w:i/>
+          <w:iCs/>
+        </w:rPr>
+        <w:t xml:space="preserve">1,2</w:t>
       </w:r>
       <w:r>
         <w:t xml:space="preserve"> </w:t>
@@ -315,13 +336,27 @@
         <w:pStyle w:val="BodyText"/>
       </w:pPr>
       <w:r>
+        <w:t xml:space="preserve">3</w:t>
+      </w:r>
+      <w:r>
+        <w:t xml:space="preserve"> </w:t>
+      </w:r>
+      <w:r>
+        <w:t xml:space="preserve">Department of Reproduction Medicine, The First Affiliated Hospital of Nanjing Medical University, Nanjing, China</w:t>
+      </w:r>
+    </w:p>
+    <w:p>
+      <w:pPr>
+        <w:pStyle w:val="BodyText"/>
+      </w:pPr>
+      <w:r>
         <w:t xml:space="preserve">*</w:t>
       </w:r>
       <w:r>
         <w:t xml:space="preserve"> </w:t>
       </w:r>
       <w:r>
-        <w:t xml:space="preserve">Corresponding author. Email: wangjunhong@jsph.org.cn</w:t>
+        <w:t xml:space="preserve">Co-corresponding authors. Email: wuxin0220@aliyun.com (X.W.); wangjunhong@jsph.org.cn (J.W.)</w:t>
       </w:r>
     </w:p>
     <w:p>

</xml_diff>

<commit_message>
Rebuild all JTM files (lead vs co-corresponding author markers)
</commit_message>
<xml_diff>
--- a/Cover_Letter_JTM.docx
+++ b/Cover_Letter_JTM.docx
@@ -273,34 +273,64 @@
         <w:t xml:space="preserve">(l2840655442@163.com), Xin Wu</w:t>
       </w:r>
       <w:r>
+        <w:t xml:space="preserve">3#</w:t>
+      </w:r>
+      <w:r>
+        <w:t xml:space="preserve"> </w:t>
+      </w:r>
+      <w:r>
+        <w:t xml:space="preserve">(wuxin0220@aliyun.com), Junhong Wang</w:t>
+      </w:r>
+      <w:r>
+        <w:t xml:space="preserve">1,2*</w:t>
+      </w:r>
+      <w:r>
+        <w:t xml:space="preserve"> </w:t>
+      </w:r>
+      <w:r>
+        <w:t xml:space="preserve">(ORCID: 0000-0003-2314-1810)</w:t>
+      </w:r>
+    </w:p>
+    <w:p>
+      <w:pPr>
+        <w:pStyle w:val="BodyText"/>
+      </w:pPr>
+      <w:r>
+        <w:t xml:space="preserve">1</w:t>
+      </w:r>
+      <w:r>
+        <w:t xml:space="preserve"> </w:t>
+      </w:r>
+      <w:r>
+        <w:t xml:space="preserve">Department of Cardiology, The First Affiliated Hospital of Nanjing Medical University, Nanjing, China</w:t>
+      </w:r>
+    </w:p>
+    <w:p>
+      <w:pPr>
+        <w:pStyle w:val="BodyText"/>
+      </w:pPr>
+      <w:r>
+        <w:t xml:space="preserve">2</w:t>
+      </w:r>
+      <w:r>
+        <w:t xml:space="preserve"> </w:t>
+      </w:r>
+      <w:r>
+        <w:t xml:space="preserve">Department of Cardiology, Liyang People’s Hospital, Liyang, China</w:t>
+      </w:r>
+    </w:p>
+    <w:p>
+      <w:pPr>
+        <w:pStyle w:val="BodyText"/>
+      </w:pPr>
+      <w:r>
         <w:t xml:space="preserve">3</w:t>
       </w:r>
       <w:r>
-        <w:rPr>
-          <w:i/>
-          <w:iCs/>
-        </w:rPr>
-        <w:t xml:space="preserve"> </w:t>
-      </w:r>
-      <w:r>
-        <w:rPr>
-          <w:i/>
-          <w:iCs/>
-        </w:rPr>
-        <w:t xml:space="preserve">(wuxin0220@aliyun.com), Junhong Wang</w:t>
-      </w:r>
-      <w:r>
-        <w:rPr>
-          <w:i/>
-          <w:iCs/>
-        </w:rPr>
-        <w:t xml:space="preserve">1,2</w:t>
-      </w:r>
-      <w:r>
-        <w:t xml:space="preserve"> </w:t>
-      </w:r>
-      <w:r>
-        <w:t xml:space="preserve">(ORCID: 0000-0003-2314-1810)</w:t>
+        <w:t xml:space="preserve"> </w:t>
+      </w:r>
+      <w:r>
+        <w:t xml:space="preserve">Department of Reproduction Medicine, The First Affiliated Hospital of Nanjing Medical University, Nanjing, China</w:t>
       </w:r>
     </w:p>
     <w:p>
@@ -308,13 +338,13 @@
         <w:pStyle w:val="BodyText"/>
       </w:pPr>
       <w:r>
-        <w:t xml:space="preserve">1</w:t>
-      </w:r>
-      <w:r>
-        <w:t xml:space="preserve"> </w:t>
-      </w:r>
-      <w:r>
-        <w:t xml:space="preserve">Department of Cardiology, The First Affiliated Hospital of Nanjing Medical University, Nanjing, China</w:t>
+        <w:t xml:space="preserve">*</w:t>
+      </w:r>
+      <w:r>
+        <w:t xml:space="preserve"> </w:t>
+      </w:r>
+      <w:r>
+        <w:t xml:space="preserve">Lead corresponding author. Email: wangjunhong@jsph.org.cn</w:t>
       </w:r>
     </w:p>
     <w:p>
@@ -322,41 +352,13 @@
         <w:pStyle w:val="BodyText"/>
       </w:pPr>
       <w:r>
-        <w:t xml:space="preserve">2</w:t>
-      </w:r>
-      <w:r>
-        <w:t xml:space="preserve"> </w:t>
-      </w:r>
-      <w:r>
-        <w:t xml:space="preserve">Department of Cardiology, Liyang People’s Hospital, Liyang, China</w:t>
-      </w:r>
-    </w:p>
-    <w:p>
-      <w:pPr>
-        <w:pStyle w:val="BodyText"/>
-      </w:pPr>
-      <w:r>
-        <w:t xml:space="preserve">3</w:t>
-      </w:r>
-      <w:r>
-        <w:t xml:space="preserve"> </w:t>
-      </w:r>
-      <w:r>
-        <w:t xml:space="preserve">Department of Reproduction Medicine, The First Affiliated Hospital of Nanjing Medical University, Nanjing, China</w:t>
-      </w:r>
-    </w:p>
-    <w:p>
-      <w:pPr>
-        <w:pStyle w:val="BodyText"/>
-      </w:pPr>
-      <w:r>
-        <w:t xml:space="preserve">*</w:t>
-      </w:r>
-      <w:r>
-        <w:t xml:space="preserve"> </w:t>
-      </w:r>
-      <w:r>
-        <w:t xml:space="preserve">Co-corresponding authors. Email: wuxin0220@aliyun.com (X.W.); wangjunhong@jsph.org.cn (J.W.)</w:t>
+        <w:t xml:space="preserve">#</w:t>
+      </w:r>
+      <w:r>
+        <w:t xml:space="preserve"> </w:t>
+      </w:r>
+      <w:r>
+        <w:t xml:space="preserve">Co-corresponding author. Email: wuxin0220@aliyun.com</w:t>
       </w:r>
     </w:p>
     <w:p>

</xml_diff>

<commit_message>
Add corresponding author clarification note in Cover Letter
</commit_message>
<xml_diff>
--- a/Cover_Letter_JTM.docx
+++ b/Cover_Letter_JTM.docx
@@ -359,6 +359,24 @@
       </w:r>
       <w:r>
         <w:t xml:space="preserve">Co-corresponding author. Email: wuxin0220@aliyun.com</w:t>
+      </w:r>
+    </w:p>
+    <w:p>
+      <w:pPr>
+        <w:pStyle w:val="BodyText"/>
+      </w:pPr>
+      <w:r>
+        <w:rPr>
+          <w:b/>
+          <w:bCs/>
+        </w:rPr>
+        <w:t xml:space="preserve">Note on corresponding author:</w:t>
+      </w:r>
+      <w:r>
+        <w:t xml:space="preserve"> </w:t>
+      </w:r>
+      <w:r>
+        <w:t xml:space="preserve">Junhong Wang is the lead corresponding author and Xin Wu is the co-corresponding author, as indicated in the manuscript and this cover letter by the asterisk (*) and hash (#) markers. For operational convenience during the submission process, Yuhe Hong (first author) is listed as the corresponding author in the submission system. The manuscript and this cover letter serve as the authoritative record for authorship and correspondence.</w:t>
       </w:r>
     </w:p>
     <w:p>

</xml_diff>